<commit_message>
fix: tarea 3 e informe
</commit_message>
<xml_diff>
--- a/Informe APO Lab.docx
+++ b/Informe APO Lab.docx
@@ -662,7 +662,7 @@
     </w:p>
     <w:p>
       <w:r>
-        <w:t>Este trabajo aplica técnicas de regresión y clasificación sobre datos históricos de producción de caña de azúcar del Ingenio Providencia, con el objetivo de predecir el rendimiento (TCH, toneladas de caña por hectárea) y la calidad (%Sacarosa.Caña), y de clasificar los lotes en niveles de desempeño Bajo/Medio/Alto. Se trabajaron dos datasets: HISTORICO_SUERTES.xlsx (21 027 registros, 85 variables) para regresión y BD_IPSA_1940.xlsx (2 187 registros, 21 variables) para clasificación. La metodología incluye un EDA exhaustivo con análisis de nulos, outliers (regla del IQR) y multicolinealidad (VIF con intercepto), preprocesamiento basado en pipelines de scikit-learn con One-Hot Encoding y escalado, validación rigurosa con hold-out 80/20 y validación cruzada de 5 vueltas, y comparación de modelos de referencia (OLS, Ridge, Logística L2, KNN) frente a modelos avanzados (Random Forest y XGBoost). Para regresión, XGBoost obtuvo el mejor desempeño con R² ≈ 0.49 en TCH y R² ≈ 0.51 en %Sac.Caña, superando holgadamente a OLS (R² ≈ 0.20). Para clasificación, Random Forest y XGBoost alcanzaron F1-macro ≈ 0.49–0.55, con AUC-macro entre 0.65 y 0.74. Las variables más influyentes resultaron ser la edad del cultivo, la dosis de madurante, las lluvias en el periodo de maduración y la variedad/zona. Los resultados son consistentes con el estado del arte agronómico y sugieren oportunidades concretas para optimizar la planificación de cosecha y la aplicación de madurantes en el ingenio.</w:t>
+        <w:t>Este trabajo aplica técnicas de regresión y clasificación sobre datos históricos de producción de caña de azúcar del Ingenio Providencia, con el objetivo de predecir el rendimiento (TCH, toneladas de caña por hectárea) y la calidad (%Sacarosa.Caña), y de clasificar los lotes en niveles de desempeño Bajo/Medio/Alto. Se trabajaron dos datasets: HISTORICO_SUERTES.xlsx (21 027 registros, 85 variables) para regresión y BD_IPSA_1940.xlsx (2 187 registros, 21 variables) para clasificación. La metodología incluye un EDA exhaustivo con análisis de nulos, outliers (regla del IQR) y multicolinealidad (VIF con intercepto), preprocesamiento basado en pipelines de scikit-learn con One-Hot Encoding y escalado, validación rigurosa con hold-out 80/20 y validación cruzada de 5 vueltas, y comparación de modelos de referencia (OLS, Ridge, Logística L2, KNN) frente a modelos avanzados (Random Forest y XGBoost). Para regresión, XGBoost obtuvo el mejor desempeño con R² = 0.52 en TCH y R² = 0.53 en %Sac.Caña, superando a OLS (R² = 0.32 y 0.27 respectivamente). Para clasificación, Random Forest y XGBoost alcanzaron F1-macro ≈ 0.42–0.52, con AUC-macro entre 0.60 y 0.71. Las variables más influyentes resultaron ser la edad del cultivo, la dosis de madurante, las lluvias en el periodo de maduración y la variedad/zona. Los resultados son consistentes con el estado del arte agronómico y sugieren oportunidades concretas para optimizar la planificación de cosecha y la aplicación de madurantes en el ingenio.</w:t>
       </w:r>
     </w:p>
     <w:p>
@@ -1466,32 +1466,32 @@
     </w:p>
     <w:p>
       <w:r>
-        <w:t>Selección de variables. Para regresión se descartaron columnas con más del 70% de valores nulos (incluidas las series climáticas alternas, fertilización detallada e infestación por diátrea), identificadores sin poder predictivo (Hacienda, Suerte, Nombre) y variables con leakage por construirse a partir de los targets (TCHM, TonAzucar, Rdto, TAH, TAHM, Brix, Pureza, %ATR, KATRHM, %Sac.Muestreadora, %Fibra Caña, %AR Jugo, %ME, Fosfato Jugo, Sac.Caña Precosecha, TonUltCorte). El conjunto final consta de 21 predictores: edad del cultivo, vejez, variedad, suelo, zona, tenencia, distancia al ingenio, tipo de quema, tipo de corte, dosis de madurante, lluvias por sub-periodo y ciclo, riego (M3 y días desde último riego) y período. Para clasificación se eligieron 10 variables numéricas (edad, cortes, lluvias, grupo_tenencia, %diatrea, dosis y semanas de madurante, vejez, mes, masa estructural). Se descartaron variedad, tipocorte, madurada y producto por ser constantes en el subconjunto (no aportan información).</w:t>
-      </w:r>
-    </w:p>
-    <w:p>
-      <w:r>
-        <w:t>Imputación. En el dataset de regresión, Suelo (17.9% nulos) recibió la categoría “DESCONOCIDO” para preservar la información de ausencia; Vejez (11.6%) se imputó con la mediana por Zona; Dist Km, Tenencia y Cod. T.Cultivo (≤0.02% nulos) con la mediana o moda global; Dosis Madurante (0.5%) con cero (la ausencia indica dosis no aplicada). Las 449 filas con %Sac.Caña nulo fueron eliminadas (no se imputan targets). El dataset de clasificación no presentó nulos.</w:t>
-      </w:r>
-    </w:p>
-    <w:p>
-      <w:r>
-        <w:t>Outliers. Se aplicó la regla del IQR con factor 3.0 sobre los targets de regresión (criterio conservador apropiado a datos agrícolas), eliminando 19 registros físicamente implausibles. Tras esta limpieza, el dataset de regresión queda en 20 559 filas.</w:t>
-      </w:r>
-    </w:p>
-    <w:p>
-      <w:r>
-        <w:t>Multicolinealidad. Se calculó el Factor de Inflación de la Varianza (VIF) sobre las variables numéricas, agregando intercepto a la matriz como exige statsmodels. Todas las variables resultaron con VIF &lt; 5: Lluvias Ciclo (3.36) y Lluvias 2 Meses Ant. (2.54) fueron las más altas, seguidas de Tenencia (1.84). Por construcción, las cuatro lluvias por sub-periodo se excluyen del VIF al sumar exactamente Lluvias Ciclo (colinealidad perfecta); para los modelos lineales se conservan únicamente las dos lluvias agregadas, mientras que los modelos de árbol incluyen todos los sub-periodos.</w:t>
-      </w:r>
-    </w:p>
-    <w:p>
-      <w:r>
-        <w:t>Codificación. Se utilizó One-Hot Encoding (sklearn ColumnTransformer + OneHotEncoder con min_frequency=0.005 para evitar la explosión por la alta cardinalidad de Variedad y Suelo) para todas las variables categóricas en todos los modelos, evitando el orden artificial que introduce LabelEncoding en modelos lineales. Las variables numéricas se estandarizaron (StandardScaler) para OLS, Ridge, Logística y KNN; los modelos de árbol no requieren escalado.</w:t>
-      </w:r>
-    </w:p>
-    <w:p>
-      <w:r>
-        <w:t>Targets de clasificación. Se crearon dos variables ordinales (Bajo/Medio/Alto) discretizando TCH y sacarosa por tertiles exactos (pd.qcut con q=3), garantizando balance de clases (≈33% cada una).</w:t>
+        <w:t>Selección de variables. Para regresión se descartaron columnas con &gt;70% de nulos, identificadores (Hacienda, Suerte, Nombre) y variables con leakage (TCHM, Ton.Azucar, Brix, Pureza, %ATR, KATRHM, Sac.Caña Precosecha y métricas de laboratorio post-cosecha). Quedan 21 predictores agronómicos, climáticos, logísticos y temporales. Para clasificación se eligieron 10 variables numéricas y se descartaron variedad/tipocorte/madurada por ser constantes en el subconjunto (BD_IPSA_1940 corresponde a la variedad CC01-1940).</w:t>
+      </w:r>
+    </w:p>
+    <w:p>
+      <w:r>
+        <w:t>Imputación. En regresión: Suelo (17.9% nulos) → categoría 'DESCONOCIDO'; Vejez (11.6%) → mediana por Zona; Dist Km, Tenencia y Cod.T.Cultivo (≤0.02%) → mediana/moda; Dosis Madurante (0.5%) → 0 (ausencia = no aplicado); 449 filas con %Sac.Caña nulo se eliminaron. Clasificación: sin nulos.</w:t>
+      </w:r>
+    </w:p>
+    <w:p>
+      <w:r>
+        <w:t>Outliers. Regla del IQR con factor 3.0 sobre los targets de regresión (criterio conservador para datos agrícolas) eliminó 19 registros físicamente implausibles. Dataset final: 20 559 filas.</w:t>
+      </w:r>
+    </w:p>
+    <w:p>
+      <w:r>
+        <w:t>Multicolinealidad. VIF (con intercepto) sobre las numéricas dio todas &lt;5 (máx Lluvias Ciclo = 3.36). Los 4 sub-periodos de lluvia se excluyen del VIF por colinealidad perfecta con Lluvias Ciclo; en lineales se conservan solo Lluvias Ciclo + Lluvias 2 Meses Ant., en árboles se incluyen todos.</w:t>
+      </w:r>
+    </w:p>
+    <w:p>
+      <w:r>
+        <w:t>Codificación. ColumnTransformer + OneHotEncoder con min_frequency=0.005 y drop='first' para lineales (evita la dummy variable trap), sin drop para árboles. Numéricas escaladas (StandardScaler) en OLS, Ridge, Logística y KNN.</w:t>
+      </w:r>
+    </w:p>
+    <w:p>
+      <w:r>
+        <w:t>Targets de clasificación. Discretización por tertiles exactos (pd.qcut, q=3) produce clases balanceadas (≈33% cada una).</w:t>
       </w:r>
     </w:p>
     <w:p>
@@ -1504,7 +1504,7 @@
     </w:p>
     <w:p>
       <w:r>
-        <w:t>La estrategia va de lo simple a lo complejo, comparando modelos lineales contra modelos de ensamble:</w:t>
+        <w:t>Estrategia: de lo simple a lo complejo, lineal vs ensamble:</w:t>
       </w:r>
     </w:p>
     <w:p>
@@ -1565,7 +1565,7 @@
     </w:p>
     <w:p>
       <w:r>
-        <w:t>Todos los modelos se entrenaron dentro de un sklearn.Pipeline acoplado al ColumnTransformer correspondiente, garantizando que el preprocesamiento se aplique solo con datos de entrenamiento dentro de cada fold de validación cruzada (sin fuga).</w:t>
+        <w:t>Todos los modelos se entrenan en un sklearn.Pipeline con el ColumnTransformer correspondiente, garantizando que el preprocesamiento se aplique solo sobre el fold de entrenamiento de cada validación cruzada (sin fuga).</w:t>
       </w:r>
     </w:p>
     <w:p>
@@ -1578,12 +1578,12 @@
     </w:p>
     <w:p>
       <w:r>
-        <w:t>Hold-out 80/20 estratificado: para regresión se estratificó por cuartiles del target para garantizar distribuciones similares en train/test; para clasificación se estratificó por la clase ordinal (un split independiente por target). Validación cruzada 5-fold sobre el conjunto de entrenamiento para sintonizar hiperparámetros y para reportar métricas estables. Reproducibilidad mediante semilla aleatoria global SEED=42.</w:t>
-      </w:r>
-    </w:p>
-    <w:p>
-      <w:r>
-        <w:t>Métricas — Regresión: R² (coeficiente de determinación), RMSE (raíz del error cuadrático medio), MAE (error absoluto medio); diagnóstico OLS con residuos vs predichos, QQ-plot, escala-localización y test de Shapiro-Wilk. Métricas — Clasificación: Accuracy, Precision, Recall, F1-macro, Cohen Kappa, y AUC One-vs-Rest macro mediante curvas ROC.</w:t>
+        <w:t>Hold-out 80/20 estratificado por cuartiles de Y (regresión) o por clase ordinal (clasificación, split independiente por target). 5-fold CV sobre train para tuning. Reproducibilidad: SEED=42.</w:t>
+      </w:r>
+    </w:p>
+    <w:p>
+      <w:r>
+        <w:t>Métricas Regresión: R², RMSE, MAE; diagnóstico OLS con residuos vs predichos, QQ-plot, escala-localización y Shapiro-Wilk. Métricas Clasificación: Accuracy, Precision, Recall, F1-macro, Cohen Kappa y AUC One-vs-Rest macro.</w:t>
       </w:r>
     </w:p>
     <w:p>
@@ -1604,7 +1604,7 @@
     </w:p>
     <w:p>
       <w:r>
-        <w:t>La Tabla 1 resume el desempeño en el set de prueba (20%) tras hyperparameter tuning con 5-fold CV. Los modelos de ensamble más que duplican el R² de los modelos lineales, evidenciando que las relaciones entre los predictores y el rendimiento de la caña son sustancialmente no lineales y con interacciones complejas — un hallazgo consistente con la literatura de agricultura de precisión.</w:t>
+        <w:t>La Tabla 1 resume el desempeño en test tras tuning 5-fold CV. Los modelos de ensamble incrementan el R² en ~0.20 puntos vs lineales, evidenciando relaciones no lineales con interacciones complejas — consistente con la literatura.</w:t>
       </w:r>
     </w:p>
     <w:tbl>
@@ -1766,39 +1766,39 @@
           </w:tcPr>
           <w:p>
             <w:r>
-              <w:t>0.16</w:t>
-            </w:r>
-          </w:p>
-        </w:tc>
-        <w:tc>
-          <w:tcPr>
-            <w:tcW w:type="dxa" w:w="1872"/>
-            <w:tcBorders>
-              <w:top w:val="single" w:sz="4" w:color="000000"/>
-              <w:left w:val="single" w:sz="4" w:color="000000"/>
-              <w:bottom w:val="single" w:sz="4" w:color="000000"/>
-              <w:right w:val="single" w:sz="4" w:color="000000"/>
-            </w:tcBorders>
-          </w:tcPr>
-          <w:p>
-            <w:r>
-              <w:t>29.19</w:t>
-            </w:r>
-          </w:p>
-        </w:tc>
-        <w:tc>
-          <w:tcPr>
-            <w:tcW w:type="dxa" w:w="1872"/>
-            <w:tcBorders>
-              <w:top w:val="single" w:sz="4" w:color="000000"/>
-              <w:left w:val="single" w:sz="4" w:color="000000"/>
-              <w:bottom w:val="single" w:sz="4" w:color="000000"/>
-              <w:right w:val="single" w:sz="4" w:color="000000"/>
-            </w:tcBorders>
-          </w:tcPr>
-          <w:p>
-            <w:r>
-              <w:t>22.51</w:t>
+              <w:t>0.3203</w:t>
+            </w:r>
+          </w:p>
+        </w:tc>
+        <w:tc>
+          <w:tcPr>
+            <w:tcW w:type="dxa" w:w="1872"/>
+            <w:tcBorders>
+              <w:top w:val="single" w:sz="4" w:color="000000"/>
+              <w:left w:val="single" w:sz="4" w:color="000000"/>
+              <w:bottom w:val="single" w:sz="4" w:color="000000"/>
+              <w:right w:val="single" w:sz="4" w:color="000000"/>
+            </w:tcBorders>
+          </w:tcPr>
+          <w:p>
+            <w:r>
+              <w:t>26.9717</w:t>
+            </w:r>
+          </w:p>
+        </w:tc>
+        <w:tc>
+          <w:tcPr>
+            <w:tcW w:type="dxa" w:w="1872"/>
+            <w:tcBorders>
+              <w:top w:val="single" w:sz="4" w:color="000000"/>
+              <w:left w:val="single" w:sz="4" w:color="000000"/>
+              <w:bottom w:val="single" w:sz="4" w:color="000000"/>
+              <w:right w:val="single" w:sz="4" w:color="000000"/>
+            </w:tcBorders>
+          </w:tcPr>
+          <w:p>
+            <w:r>
+              <w:t>20.6633</w:t>
             </w:r>
           </w:p>
         </w:tc>
@@ -1848,39 +1848,39 @@
           </w:tcPr>
           <w:p>
             <w:r>
-              <w:t>0.16</w:t>
-            </w:r>
-          </w:p>
-        </w:tc>
-        <w:tc>
-          <w:tcPr>
-            <w:tcW w:type="dxa" w:w="1872"/>
-            <w:tcBorders>
-              <w:top w:val="single" w:sz="4" w:color="000000"/>
-              <w:left w:val="single" w:sz="4" w:color="000000"/>
-              <w:bottom w:val="single" w:sz="4" w:color="000000"/>
-              <w:right w:val="single" w:sz="4" w:color="000000"/>
-            </w:tcBorders>
-          </w:tcPr>
-          <w:p>
-            <w:r>
-              <w:t>29.18</w:t>
-            </w:r>
-          </w:p>
-        </w:tc>
-        <w:tc>
-          <w:tcPr>
-            <w:tcW w:type="dxa" w:w="1872"/>
-            <w:tcBorders>
-              <w:top w:val="single" w:sz="4" w:color="000000"/>
-              <w:left w:val="single" w:sz="4" w:color="000000"/>
-              <w:bottom w:val="single" w:sz="4" w:color="000000"/>
-              <w:right w:val="single" w:sz="4" w:color="000000"/>
-            </w:tcBorders>
-          </w:tcPr>
-          <w:p>
-            <w:r>
-              <w:t>22.51</w:t>
+              <w:t>0.3202</w:t>
+            </w:r>
+          </w:p>
+        </w:tc>
+        <w:tc>
+          <w:tcPr>
+            <w:tcW w:type="dxa" w:w="1872"/>
+            <w:tcBorders>
+              <w:top w:val="single" w:sz="4" w:color="000000"/>
+              <w:left w:val="single" w:sz="4" w:color="000000"/>
+              <w:bottom w:val="single" w:sz="4" w:color="000000"/>
+              <w:right w:val="single" w:sz="4" w:color="000000"/>
+            </w:tcBorders>
+          </w:tcPr>
+          <w:p>
+            <w:r>
+              <w:t>26.9741</w:t>
+            </w:r>
+          </w:p>
+        </w:tc>
+        <w:tc>
+          <w:tcPr>
+            <w:tcW w:type="dxa" w:w="1872"/>
+            <w:tcBorders>
+              <w:top w:val="single" w:sz="4" w:color="000000"/>
+              <w:left w:val="single" w:sz="4" w:color="000000"/>
+              <w:bottom w:val="single" w:sz="4" w:color="000000"/>
+              <w:right w:val="single" w:sz="4" w:color="000000"/>
+            </w:tcBorders>
+          </w:tcPr>
+          <w:p>
+            <w:r>
+              <w:t>20.6667</w:t>
             </w:r>
           </w:p>
         </w:tc>
@@ -1930,39 +1930,39 @@
           </w:tcPr>
           <w:p>
             <w:r>
-              <w:t>0.46</w:t>
-            </w:r>
-          </w:p>
-        </w:tc>
-        <w:tc>
-          <w:tcPr>
-            <w:tcW w:type="dxa" w:w="1872"/>
-            <w:tcBorders>
-              <w:top w:val="single" w:sz="4" w:color="000000"/>
-              <w:left w:val="single" w:sz="4" w:color="000000"/>
-              <w:bottom w:val="single" w:sz="4" w:color="000000"/>
-              <w:right w:val="single" w:sz="4" w:color="000000"/>
-            </w:tcBorders>
-          </w:tcPr>
-          <w:p>
-            <w:r>
-              <w:t>23.51</w:t>
-            </w:r>
-          </w:p>
-        </w:tc>
-        <w:tc>
-          <w:tcPr>
-            <w:tcW w:type="dxa" w:w="1872"/>
-            <w:tcBorders>
-              <w:top w:val="single" w:sz="4" w:color="000000"/>
-              <w:left w:val="single" w:sz="4" w:color="000000"/>
-              <w:bottom w:val="single" w:sz="4" w:color="000000"/>
-              <w:right w:val="single" w:sz="4" w:color="000000"/>
-            </w:tcBorders>
-          </w:tcPr>
-          <w:p>
-            <w:r>
-              <w:t>17.71</w:t>
+              <w:t>0.4815</w:t>
+            </w:r>
+          </w:p>
+        </w:tc>
+        <w:tc>
+          <w:tcPr>
+            <w:tcW w:type="dxa" w:w="1872"/>
+            <w:tcBorders>
+              <w:top w:val="single" w:sz="4" w:color="000000"/>
+              <w:left w:val="single" w:sz="4" w:color="000000"/>
+              <w:bottom w:val="single" w:sz="4" w:color="000000"/>
+              <w:right w:val="single" w:sz="4" w:color="000000"/>
+            </w:tcBorders>
+          </w:tcPr>
+          <w:p>
+            <w:r>
+              <w:t>23.5571</w:t>
+            </w:r>
+          </w:p>
+        </w:tc>
+        <w:tc>
+          <w:tcPr>
+            <w:tcW w:type="dxa" w:w="1872"/>
+            <w:tcBorders>
+              <w:top w:val="single" w:sz="4" w:color="000000"/>
+              <w:left w:val="single" w:sz="4" w:color="000000"/>
+              <w:bottom w:val="single" w:sz="4" w:color="000000"/>
+              <w:right w:val="single" w:sz="4" w:color="000000"/>
+            </w:tcBorders>
+          </w:tcPr>
+          <w:p>
+            <w:r>
+              <w:t>17.4119</w:t>
             </w:r>
           </w:p>
         </w:tc>
@@ -2012,39 +2012,39 @@
           </w:tcPr>
           <w:p>
             <w:r>
-              <w:t>0.49</w:t>
-            </w:r>
-          </w:p>
-        </w:tc>
-        <w:tc>
-          <w:tcPr>
-            <w:tcW w:type="dxa" w:w="1872"/>
-            <w:tcBorders>
-              <w:top w:val="single" w:sz="4" w:color="000000"/>
-              <w:left w:val="single" w:sz="4" w:color="000000"/>
-              <w:bottom w:val="single" w:sz="4" w:color="000000"/>
-              <w:right w:val="single" w:sz="4" w:color="000000"/>
-            </w:tcBorders>
-          </w:tcPr>
-          <w:p>
-            <w:r>
-              <w:t>22.80</w:t>
-            </w:r>
-          </w:p>
-        </w:tc>
-        <w:tc>
-          <w:tcPr>
-            <w:tcW w:type="dxa" w:w="1872"/>
-            <w:tcBorders>
-              <w:top w:val="single" w:sz="4" w:color="000000"/>
-              <w:left w:val="single" w:sz="4" w:color="000000"/>
-              <w:bottom w:val="single" w:sz="4" w:color="000000"/>
-              <w:right w:val="single" w:sz="4" w:color="000000"/>
-            </w:tcBorders>
-          </w:tcPr>
-          <w:p>
-            <w:r>
-              <w:t>17.23</w:t>
+              <w:t>0.5191</w:t>
+            </w:r>
+          </w:p>
+        </w:tc>
+        <w:tc>
+          <w:tcPr>
+            <w:tcW w:type="dxa" w:w="1872"/>
+            <w:tcBorders>
+              <w:top w:val="single" w:sz="4" w:color="000000"/>
+              <w:left w:val="single" w:sz="4" w:color="000000"/>
+              <w:bottom w:val="single" w:sz="4" w:color="000000"/>
+              <w:right w:val="single" w:sz="4" w:color="000000"/>
+            </w:tcBorders>
+          </w:tcPr>
+          <w:p>
+            <w:r>
+              <w:t>22.6874</w:t>
+            </w:r>
+          </w:p>
+        </w:tc>
+        <w:tc>
+          <w:tcPr>
+            <w:tcW w:type="dxa" w:w="1872"/>
+            <w:tcBorders>
+              <w:top w:val="single" w:sz="4" w:color="000000"/>
+              <w:left w:val="single" w:sz="4" w:color="000000"/>
+              <w:bottom w:val="single" w:sz="4" w:color="000000"/>
+              <w:right w:val="single" w:sz="4" w:color="000000"/>
+            </w:tcBorders>
+          </w:tcPr>
+          <w:p>
+            <w:r>
+              <w:t>16.8027</w:t>
             </w:r>
           </w:p>
         </w:tc>
@@ -2094,39 +2094,39 @@
           </w:tcPr>
           <w:p>
             <w:r>
-              <w:t>0.20</w:t>
-            </w:r>
-          </w:p>
-        </w:tc>
-        <w:tc>
-          <w:tcPr>
-            <w:tcW w:type="dxa" w:w="1872"/>
-            <w:tcBorders>
-              <w:top w:val="single" w:sz="4" w:color="000000"/>
-              <w:left w:val="single" w:sz="4" w:color="000000"/>
-              <w:bottom w:val="single" w:sz="4" w:color="000000"/>
-              <w:right w:val="single" w:sz="4" w:color="000000"/>
-            </w:tcBorders>
-          </w:tcPr>
-          <w:p>
-            <w:r>
-              <w:t>1.012</w:t>
-            </w:r>
-          </w:p>
-        </w:tc>
-        <w:tc>
-          <w:tcPr>
-            <w:tcW w:type="dxa" w:w="1872"/>
-            <w:tcBorders>
-              <w:top w:val="single" w:sz="4" w:color="000000"/>
-              <w:left w:val="single" w:sz="4" w:color="000000"/>
-              <w:bottom w:val="single" w:sz="4" w:color="000000"/>
-              <w:right w:val="single" w:sz="4" w:color="000000"/>
-            </w:tcBorders>
-          </w:tcPr>
-          <w:p>
-            <w:r>
-              <w:t>0.791</w:t>
+              <w:t>0.2651</w:t>
+            </w:r>
+          </w:p>
+        </w:tc>
+        <w:tc>
+          <w:tcPr>
+            <w:tcW w:type="dxa" w:w="1872"/>
+            <w:tcBorders>
+              <w:top w:val="single" w:sz="4" w:color="000000"/>
+              <w:left w:val="single" w:sz="4" w:color="000000"/>
+              <w:bottom w:val="single" w:sz="4" w:color="000000"/>
+              <w:right w:val="single" w:sz="4" w:color="000000"/>
+            </w:tcBorders>
+          </w:tcPr>
+          <w:p>
+            <w:r>
+              <w:t>0.9830</w:t>
+            </w:r>
+          </w:p>
+        </w:tc>
+        <w:tc>
+          <w:tcPr>
+            <w:tcW w:type="dxa" w:w="1872"/>
+            <w:tcBorders>
+              <w:top w:val="single" w:sz="4" w:color="000000"/>
+              <w:left w:val="single" w:sz="4" w:color="000000"/>
+              <w:bottom w:val="single" w:sz="4" w:color="000000"/>
+              <w:right w:val="single" w:sz="4" w:color="000000"/>
+            </w:tcBorders>
+          </w:tcPr>
+          <w:p>
+            <w:r>
+              <w:t>0.7666</w:t>
             </w:r>
           </w:p>
         </w:tc>
@@ -2176,39 +2176,39 @@
           </w:tcPr>
           <w:p>
             <w:r>
-              <w:t>0.20</w:t>
-            </w:r>
-          </w:p>
-        </w:tc>
-        <w:tc>
-          <w:tcPr>
-            <w:tcW w:type="dxa" w:w="1872"/>
-            <w:tcBorders>
-              <w:top w:val="single" w:sz="4" w:color="000000"/>
-              <w:left w:val="single" w:sz="4" w:color="000000"/>
-              <w:bottom w:val="single" w:sz="4" w:color="000000"/>
-              <w:right w:val="single" w:sz="4" w:color="000000"/>
-            </w:tcBorders>
-          </w:tcPr>
-          <w:p>
-            <w:r>
-              <w:t>1.012</w:t>
-            </w:r>
-          </w:p>
-        </w:tc>
-        <w:tc>
-          <w:tcPr>
-            <w:tcW w:type="dxa" w:w="1872"/>
-            <w:tcBorders>
-              <w:top w:val="single" w:sz="4" w:color="000000"/>
-              <w:left w:val="single" w:sz="4" w:color="000000"/>
-              <w:bottom w:val="single" w:sz="4" w:color="000000"/>
-              <w:right w:val="single" w:sz="4" w:color="000000"/>
-            </w:tcBorders>
-          </w:tcPr>
-          <w:p>
-            <w:r>
-              <w:t>0.791</w:t>
+              <w:t>0.2647</w:t>
+            </w:r>
+          </w:p>
+        </w:tc>
+        <w:tc>
+          <w:tcPr>
+            <w:tcW w:type="dxa" w:w="1872"/>
+            <w:tcBorders>
+              <w:top w:val="single" w:sz="4" w:color="000000"/>
+              <w:left w:val="single" w:sz="4" w:color="000000"/>
+              <w:bottom w:val="single" w:sz="4" w:color="000000"/>
+              <w:right w:val="single" w:sz="4" w:color="000000"/>
+            </w:tcBorders>
+          </w:tcPr>
+          <w:p>
+            <w:r>
+              <w:t>0.9833</w:t>
+            </w:r>
+          </w:p>
+        </w:tc>
+        <w:tc>
+          <w:tcPr>
+            <w:tcW w:type="dxa" w:w="1872"/>
+            <w:tcBorders>
+              <w:top w:val="single" w:sz="4" w:color="000000"/>
+              <w:left w:val="single" w:sz="4" w:color="000000"/>
+              <w:bottom w:val="single" w:sz="4" w:color="000000"/>
+              <w:right w:val="single" w:sz="4" w:color="000000"/>
+            </w:tcBorders>
+          </w:tcPr>
+          <w:p>
+            <w:r>
+              <w:t>0.7666</w:t>
             </w:r>
           </w:p>
         </w:tc>
@@ -2258,39 +2258,39 @@
           </w:tcPr>
           <w:p>
             <w:r>
-              <w:t>0.49</w:t>
-            </w:r>
-          </w:p>
-        </w:tc>
-        <w:tc>
-          <w:tcPr>
-            <w:tcW w:type="dxa" w:w="1872"/>
-            <w:tcBorders>
-              <w:top w:val="single" w:sz="4" w:color="000000"/>
-              <w:left w:val="single" w:sz="4" w:color="000000"/>
-              <w:bottom w:val="single" w:sz="4" w:color="000000"/>
-              <w:right w:val="single" w:sz="4" w:color="000000"/>
-            </w:tcBorders>
-          </w:tcPr>
-          <w:p>
-            <w:r>
-              <w:t>0.803</w:t>
-            </w:r>
-          </w:p>
-        </w:tc>
-        <w:tc>
-          <w:tcPr>
-            <w:tcW w:type="dxa" w:w="1872"/>
-            <w:tcBorders>
-              <w:top w:val="single" w:sz="4" w:color="000000"/>
-              <w:left w:val="single" w:sz="4" w:color="000000"/>
-              <w:bottom w:val="single" w:sz="4" w:color="000000"/>
-              <w:right w:val="single" w:sz="4" w:color="000000"/>
-            </w:tcBorders>
-          </w:tcPr>
-          <w:p>
-            <w:r>
-              <w:t>0.615</w:t>
+              <w:t>0.4881</w:t>
+            </w:r>
+          </w:p>
+        </w:tc>
+        <w:tc>
+          <w:tcPr>
+            <w:tcW w:type="dxa" w:w="1872"/>
+            <w:tcBorders>
+              <w:top w:val="single" w:sz="4" w:color="000000"/>
+              <w:left w:val="single" w:sz="4" w:color="000000"/>
+              <w:bottom w:val="single" w:sz="4" w:color="000000"/>
+              <w:right w:val="single" w:sz="4" w:color="000000"/>
+            </w:tcBorders>
+          </w:tcPr>
+          <w:p>
+            <w:r>
+              <w:t>0.8204</w:t>
+            </w:r>
+          </w:p>
+        </w:tc>
+        <w:tc>
+          <w:tcPr>
+            <w:tcW w:type="dxa" w:w="1872"/>
+            <w:tcBorders>
+              <w:top w:val="single" w:sz="4" w:color="000000"/>
+              <w:left w:val="single" w:sz="4" w:color="000000"/>
+              <w:bottom w:val="single" w:sz="4" w:color="000000"/>
+              <w:right w:val="single" w:sz="4" w:color="000000"/>
+            </w:tcBorders>
+          </w:tcPr>
+          <w:p>
+            <w:r>
+              <w:t>0.6278</w:t>
             </w:r>
           </w:p>
         </w:tc>
@@ -2340,39 +2340,39 @@
           </w:tcPr>
           <w:p>
             <w:r>
-              <w:t>0.51</w:t>
-            </w:r>
-          </w:p>
-        </w:tc>
-        <w:tc>
-          <w:tcPr>
-            <w:tcW w:type="dxa" w:w="1872"/>
-            <w:tcBorders>
-              <w:top w:val="single" w:sz="4" w:color="000000"/>
-              <w:left w:val="single" w:sz="4" w:color="000000"/>
-              <w:bottom w:val="single" w:sz="4" w:color="000000"/>
-              <w:right w:val="single" w:sz="4" w:color="000000"/>
-            </w:tcBorders>
-          </w:tcPr>
-          <w:p>
-            <w:r>
-              <w:t>0.791</w:t>
-            </w:r>
-          </w:p>
-        </w:tc>
-        <w:tc>
-          <w:tcPr>
-            <w:tcW w:type="dxa" w:w="1872"/>
-            <w:tcBorders>
-              <w:top w:val="single" w:sz="4" w:color="000000"/>
-              <w:left w:val="single" w:sz="4" w:color="000000"/>
-              <w:bottom w:val="single" w:sz="4" w:color="000000"/>
-              <w:right w:val="single" w:sz="4" w:color="000000"/>
-            </w:tcBorders>
-          </w:tcPr>
-          <w:p>
-            <w:r>
-              <w:t>0.607</w:t>
+              <w:t>0.5267</w:t>
+            </w:r>
+          </w:p>
+        </w:tc>
+        <w:tc>
+          <w:tcPr>
+            <w:tcW w:type="dxa" w:w="1872"/>
+            <w:tcBorders>
+              <w:top w:val="single" w:sz="4" w:color="000000"/>
+              <w:left w:val="single" w:sz="4" w:color="000000"/>
+              <w:bottom w:val="single" w:sz="4" w:color="000000"/>
+              <w:right w:val="single" w:sz="4" w:color="000000"/>
+            </w:tcBorders>
+          </w:tcPr>
+          <w:p>
+            <w:r>
+              <w:t>0.7889</w:t>
+            </w:r>
+          </w:p>
+        </w:tc>
+        <w:tc>
+          <w:tcPr>
+            <w:tcW w:type="dxa" w:w="1872"/>
+            <w:tcBorders>
+              <w:top w:val="single" w:sz="4" w:color="000000"/>
+              <w:left w:val="single" w:sz="4" w:color="000000"/>
+              <w:bottom w:val="single" w:sz="4" w:color="000000"/>
+              <w:right w:val="single" w:sz="4" w:color="000000"/>
+            </w:tcBorders>
+          </w:tcPr>
+          <w:p>
+            <w:r>
+              <w:t>0.6012</w:t>
             </w:r>
           </w:p>
         </w:tc>
@@ -2380,7 +2380,7 @@
     </w:tbl>
     <w:p>
       <w:r>
-        <w:t>XGBoost es el modelo ganador para los dos targets de regresión. Para TCH el RMSE de 22.8 ton/ha equivale a un error típico de ~17.5% sobre la media de 130 ton/ha; para %Sac.Caña el RMSE de 0.79 puntos porcentuales es del orden de la propia desviación natural del indicador (~1.1 pp). Los coeficientes OLS (significativos al 5%) confirman las relaciones esperadas: signo positivo para Edad Ult Cos y Dosis Madurante (más maduración → más azúcar), signo negativo para Lluvias 2 Meses Ant. en %Sac.Caña (exceso de agua diluye sacarosa). La importancia de variables del XGBoost destaca consistentemente la edad del cultivo, la dosis de madurante y las variables de variedad y zona como los predictores más informativos.</w:t>
+        <w:t>XGBoost gana en ambos targets de regresión.</w:t>
       </w:r>
     </w:p>
     <w:p>
@@ -2393,7 +2393,7 @@
     </w:p>
     <w:p>
       <w:r>
-        <w:t>La Tabla 2 muestra el desempeño en el set de prueba para los dos targets de clasificación, aplicando el mismo split estratificado a todos los modelos. Para nivel_TCH el F1-macro ronda 0.45–0.49, mientras que para nivel_sacarosa los modelos avanzados alcanzan 0.55. La Kappa (entre 0.18 y 0.35) indica un acuerdo modesto pero claramente superior al azar (Kappa = 0).</w:t>
+        <w:t>La Tabla 2 reporta el desempeño en test.</w:t>
       </w:r>
     </w:p>
     <w:tbl>
@@ -2555,39 +2555,39 @@
           </w:tcPr>
           <w:p>
             <w:r>
-              <w:t>0.477</w:t>
-            </w:r>
-          </w:p>
-        </w:tc>
-        <w:tc>
-          <w:tcPr>
-            <w:tcW w:type="dxa" w:w="1872"/>
-            <w:tcBorders>
-              <w:top w:val="single" w:sz="4" w:color="000000"/>
-              <w:left w:val="single" w:sz="4" w:color="000000"/>
-              <w:bottom w:val="single" w:sz="4" w:color="000000"/>
-              <w:right w:val="single" w:sz="4" w:color="000000"/>
-            </w:tcBorders>
-          </w:tcPr>
-          <w:p>
-            <w:r>
-              <w:t>0.475</w:t>
-            </w:r>
-          </w:p>
-        </w:tc>
-        <w:tc>
-          <w:tcPr>
-            <w:tcW w:type="dxa" w:w="1872"/>
-            <w:tcBorders>
-              <w:top w:val="single" w:sz="4" w:color="000000"/>
-              <w:left w:val="single" w:sz="4" w:color="000000"/>
-              <w:bottom w:val="single" w:sz="4" w:color="000000"/>
-              <w:right w:val="single" w:sz="4" w:color="000000"/>
-            </w:tcBorders>
-          </w:tcPr>
-          <w:p>
-            <w:r>
-              <w:t>0.216</w:t>
+              <w:t>0.4361</w:t>
+            </w:r>
+          </w:p>
+        </w:tc>
+        <w:tc>
+          <w:tcPr>
+            <w:tcW w:type="dxa" w:w="1872"/>
+            <w:tcBorders>
+              <w:top w:val="single" w:sz="4" w:color="000000"/>
+              <w:left w:val="single" w:sz="4" w:color="000000"/>
+              <w:bottom w:val="single" w:sz="4" w:color="000000"/>
+              <w:right w:val="single" w:sz="4" w:color="000000"/>
+            </w:tcBorders>
+          </w:tcPr>
+          <w:p>
+            <w:r>
+              <w:t>0.4222</w:t>
+            </w:r>
+          </w:p>
+        </w:tc>
+        <w:tc>
+          <w:tcPr>
+            <w:tcW w:type="dxa" w:w="1872"/>
+            <w:tcBorders>
+              <w:top w:val="single" w:sz="4" w:color="000000"/>
+              <w:left w:val="single" w:sz="4" w:color="000000"/>
+              <w:bottom w:val="single" w:sz="4" w:color="000000"/>
+              <w:right w:val="single" w:sz="4" w:color="000000"/>
+            </w:tcBorders>
+          </w:tcPr>
+          <w:p>
+            <w:r>
+              <w:t>0.1501</w:t>
             </w:r>
           </w:p>
         </w:tc>
@@ -2637,39 +2637,39 @@
           </w:tcPr>
           <w:p>
             <w:r>
-              <w:t>0.454</w:t>
-            </w:r>
-          </w:p>
-        </w:tc>
-        <w:tc>
-          <w:tcPr>
-            <w:tcW w:type="dxa" w:w="1872"/>
-            <w:tcBorders>
-              <w:top w:val="single" w:sz="4" w:color="000000"/>
-              <w:left w:val="single" w:sz="4" w:color="000000"/>
-              <w:bottom w:val="single" w:sz="4" w:color="000000"/>
-              <w:right w:val="single" w:sz="4" w:color="000000"/>
-            </w:tcBorders>
-          </w:tcPr>
-          <w:p>
-            <w:r>
-              <w:t>0.453</w:t>
-            </w:r>
-          </w:p>
-        </w:tc>
-        <w:tc>
-          <w:tcPr>
-            <w:tcW w:type="dxa" w:w="1872"/>
-            <w:tcBorders>
-              <w:top w:val="single" w:sz="4" w:color="000000"/>
-              <w:left w:val="single" w:sz="4" w:color="000000"/>
-              <w:bottom w:val="single" w:sz="4" w:color="000000"/>
-              <w:right w:val="single" w:sz="4" w:color="000000"/>
-            </w:tcBorders>
-          </w:tcPr>
-          <w:p>
-            <w:r>
-              <w:t>0.181</w:t>
+              <w:t>0.4338</w:t>
+            </w:r>
+          </w:p>
+        </w:tc>
+        <w:tc>
+          <w:tcPr>
+            <w:tcW w:type="dxa" w:w="1872"/>
+            <w:tcBorders>
+              <w:top w:val="single" w:sz="4" w:color="000000"/>
+              <w:left w:val="single" w:sz="4" w:color="000000"/>
+              <w:bottom w:val="single" w:sz="4" w:color="000000"/>
+              <w:right w:val="single" w:sz="4" w:color="000000"/>
+            </w:tcBorders>
+          </w:tcPr>
+          <w:p>
+            <w:r>
+              <w:t>0.4272</w:t>
+            </w:r>
+          </w:p>
+        </w:tc>
+        <w:tc>
+          <w:tcPr>
+            <w:tcW w:type="dxa" w:w="1872"/>
+            <w:tcBorders>
+              <w:top w:val="single" w:sz="4" w:color="000000"/>
+              <w:left w:val="single" w:sz="4" w:color="000000"/>
+              <w:bottom w:val="single" w:sz="4" w:color="000000"/>
+              <w:right w:val="single" w:sz="4" w:color="000000"/>
+            </w:tcBorders>
+          </w:tcPr>
+          <w:p>
+            <w:r>
+              <w:t>0.1498</w:t>
             </w:r>
           </w:p>
         </w:tc>
@@ -2719,39 +2719,39 @@
           </w:tcPr>
           <w:p>
             <w:r>
-              <w:t>0.489</w:t>
-            </w:r>
-          </w:p>
-        </w:tc>
-        <w:tc>
-          <w:tcPr>
-            <w:tcW w:type="dxa" w:w="1872"/>
-            <w:tcBorders>
-              <w:top w:val="single" w:sz="4" w:color="000000"/>
-              <w:left w:val="single" w:sz="4" w:color="000000"/>
-              <w:bottom w:val="single" w:sz="4" w:color="000000"/>
-              <w:right w:val="single" w:sz="4" w:color="000000"/>
-            </w:tcBorders>
-          </w:tcPr>
-          <w:p>
-            <w:r>
-              <w:t>0.490</w:t>
-            </w:r>
-          </w:p>
-        </w:tc>
-        <w:tc>
-          <w:tcPr>
-            <w:tcW w:type="dxa" w:w="1872"/>
-            <w:tcBorders>
-              <w:top w:val="single" w:sz="4" w:color="000000"/>
-              <w:left w:val="single" w:sz="4" w:color="000000"/>
-              <w:bottom w:val="single" w:sz="4" w:color="000000"/>
-              <w:right w:val="single" w:sz="4" w:color="000000"/>
-            </w:tcBorders>
-          </w:tcPr>
-          <w:p>
-            <w:r>
-              <w:t>0.232</w:t>
+              <w:t>0.4703</w:t>
+            </w:r>
+          </w:p>
+        </w:tc>
+        <w:tc>
+          <w:tcPr>
+            <w:tcW w:type="dxa" w:w="1872"/>
+            <w:tcBorders>
+              <w:top w:val="single" w:sz="4" w:color="000000"/>
+              <w:left w:val="single" w:sz="4" w:color="000000"/>
+              <w:bottom w:val="single" w:sz="4" w:color="000000"/>
+              <w:right w:val="single" w:sz="4" w:color="000000"/>
+            </w:tcBorders>
+          </w:tcPr>
+          <w:p>
+            <w:r>
+              <w:t>0.4683</w:t>
+            </w:r>
+          </w:p>
+        </w:tc>
+        <w:tc>
+          <w:tcPr>
+            <w:tcW w:type="dxa" w:w="1872"/>
+            <w:tcBorders>
+              <w:top w:val="single" w:sz="4" w:color="000000"/>
+              <w:left w:val="single" w:sz="4" w:color="000000"/>
+              <w:bottom w:val="single" w:sz="4" w:color="000000"/>
+              <w:right w:val="single" w:sz="4" w:color="000000"/>
+            </w:tcBorders>
+          </w:tcPr>
+          <w:p>
+            <w:r>
+              <w:t>0.2045</w:t>
             </w:r>
           </w:p>
         </w:tc>
@@ -2801,39 +2801,39 @@
           </w:tcPr>
           <w:p>
             <w:r>
-              <w:t>0.477</w:t>
-            </w:r>
-          </w:p>
-        </w:tc>
-        <w:tc>
-          <w:tcPr>
-            <w:tcW w:type="dxa" w:w="1872"/>
-            <w:tcBorders>
-              <w:top w:val="single" w:sz="4" w:color="000000"/>
-              <w:left w:val="single" w:sz="4" w:color="000000"/>
-              <w:bottom w:val="single" w:sz="4" w:color="000000"/>
-              <w:right w:val="single" w:sz="4" w:color="000000"/>
-            </w:tcBorders>
-          </w:tcPr>
-          <w:p>
-            <w:r>
-              <w:t>0.478</w:t>
-            </w:r>
-          </w:p>
-        </w:tc>
-        <w:tc>
-          <w:tcPr>
-            <w:tcW w:type="dxa" w:w="1872"/>
-            <w:tcBorders>
-              <w:top w:val="single" w:sz="4" w:color="000000"/>
-              <w:left w:val="single" w:sz="4" w:color="000000"/>
-              <w:bottom w:val="single" w:sz="4" w:color="000000"/>
-              <w:right w:val="single" w:sz="4" w:color="000000"/>
-            </w:tcBorders>
-          </w:tcPr>
-          <w:p>
-            <w:r>
-              <w:t>0.214</w:t>
+              <w:t>0.4429</w:t>
+            </w:r>
+          </w:p>
+        </w:tc>
+        <w:tc>
+          <w:tcPr>
+            <w:tcW w:type="dxa" w:w="1872"/>
+            <w:tcBorders>
+              <w:top w:val="single" w:sz="4" w:color="000000"/>
+              <w:left w:val="single" w:sz="4" w:color="000000"/>
+              <w:bottom w:val="single" w:sz="4" w:color="000000"/>
+              <w:right w:val="single" w:sz="4" w:color="000000"/>
+            </w:tcBorders>
+          </w:tcPr>
+          <w:p>
+            <w:r>
+              <w:t>0.4426</w:t>
+            </w:r>
+          </w:p>
+        </w:tc>
+        <w:tc>
+          <w:tcPr>
+            <w:tcW w:type="dxa" w:w="1872"/>
+            <w:tcBorders>
+              <w:top w:val="single" w:sz="4" w:color="000000"/>
+              <w:left w:val="single" w:sz="4" w:color="000000"/>
+              <w:bottom w:val="single" w:sz="4" w:color="000000"/>
+              <w:right w:val="single" w:sz="4" w:color="000000"/>
+            </w:tcBorders>
+          </w:tcPr>
+          <w:p>
+            <w:r>
+              <w:t>0.1643</w:t>
             </w:r>
           </w:p>
         </w:tc>
@@ -2883,39 +2883,39 @@
           </w:tcPr>
           <w:p>
             <w:r>
-              <w:t>0.500</w:t>
-            </w:r>
-          </w:p>
-        </w:tc>
-        <w:tc>
-          <w:tcPr>
-            <w:tcW w:type="dxa" w:w="1872"/>
-            <w:tcBorders>
-              <w:top w:val="single" w:sz="4" w:color="000000"/>
-              <w:left w:val="single" w:sz="4" w:color="000000"/>
-              <w:bottom w:val="single" w:sz="4" w:color="000000"/>
-              <w:right w:val="single" w:sz="4" w:color="000000"/>
-            </w:tcBorders>
-          </w:tcPr>
-          <w:p>
-            <w:r>
-              <w:t>0.479</w:t>
-            </w:r>
-          </w:p>
-        </w:tc>
-        <w:tc>
-          <w:tcPr>
-            <w:tcW w:type="dxa" w:w="1872"/>
-            <w:tcBorders>
-              <w:top w:val="single" w:sz="4" w:color="000000"/>
-              <w:left w:val="single" w:sz="4" w:color="000000"/>
-              <w:bottom w:val="single" w:sz="4" w:color="000000"/>
-              <w:right w:val="single" w:sz="4" w:color="000000"/>
-            </w:tcBorders>
-          </w:tcPr>
-          <w:p>
-            <w:r>
-              <w:t>0.244</w:t>
+              <w:t>0.4589</w:t>
+            </w:r>
+          </w:p>
+        </w:tc>
+        <w:tc>
+          <w:tcPr>
+            <w:tcW w:type="dxa" w:w="1872"/>
+            <w:tcBorders>
+              <w:top w:val="single" w:sz="4" w:color="000000"/>
+              <w:left w:val="single" w:sz="4" w:color="000000"/>
+              <w:bottom w:val="single" w:sz="4" w:color="000000"/>
+              <w:right w:val="single" w:sz="4" w:color="000000"/>
+            </w:tcBorders>
+          </w:tcPr>
+          <w:p>
+            <w:r>
+              <w:t>0.4369</w:t>
+            </w:r>
+          </w:p>
+        </w:tc>
+        <w:tc>
+          <w:tcPr>
+            <w:tcW w:type="dxa" w:w="1872"/>
+            <w:tcBorders>
+              <w:top w:val="single" w:sz="4" w:color="000000"/>
+              <w:left w:val="single" w:sz="4" w:color="000000"/>
+              <w:bottom w:val="single" w:sz="4" w:color="000000"/>
+              <w:right w:val="single" w:sz="4" w:color="000000"/>
+            </w:tcBorders>
+          </w:tcPr>
+          <w:p>
+            <w:r>
+              <w:t>0.1847</w:t>
             </w:r>
           </w:p>
         </w:tc>
@@ -2965,39 +2965,39 @@
           </w:tcPr>
           <w:p>
             <w:r>
-              <w:t>0.532</w:t>
-            </w:r>
-          </w:p>
-        </w:tc>
-        <w:tc>
-          <w:tcPr>
-            <w:tcW w:type="dxa" w:w="1872"/>
-            <w:tcBorders>
-              <w:top w:val="single" w:sz="4" w:color="000000"/>
-              <w:left w:val="single" w:sz="4" w:color="000000"/>
-              <w:bottom w:val="single" w:sz="4" w:color="000000"/>
-              <w:right w:val="single" w:sz="4" w:color="000000"/>
-            </w:tcBorders>
-          </w:tcPr>
-          <w:p>
-            <w:r>
-              <w:t>0.528</w:t>
-            </w:r>
-          </w:p>
-        </w:tc>
-        <w:tc>
-          <w:tcPr>
-            <w:tcW w:type="dxa" w:w="1872"/>
-            <w:tcBorders>
-              <w:top w:val="single" w:sz="4" w:color="000000"/>
-              <w:left w:val="single" w:sz="4" w:color="000000"/>
-              <w:bottom w:val="single" w:sz="4" w:color="000000"/>
-              <w:right w:val="single" w:sz="4" w:color="000000"/>
-            </w:tcBorders>
-          </w:tcPr>
-          <w:p>
-            <w:r>
-              <w:t>0.300</w:t>
+              <w:t>0.4977</w:t>
+            </w:r>
+          </w:p>
+        </w:tc>
+        <w:tc>
+          <w:tcPr>
+            <w:tcW w:type="dxa" w:w="1872"/>
+            <w:tcBorders>
+              <w:top w:val="single" w:sz="4" w:color="000000"/>
+              <w:left w:val="single" w:sz="4" w:color="000000"/>
+              <w:bottom w:val="single" w:sz="4" w:color="000000"/>
+              <w:right w:val="single" w:sz="4" w:color="000000"/>
+            </w:tcBorders>
+          </w:tcPr>
+          <w:p>
+            <w:r>
+              <w:t>0.4860</w:t>
+            </w:r>
+          </w:p>
+        </w:tc>
+        <w:tc>
+          <w:tcPr>
+            <w:tcW w:type="dxa" w:w="1872"/>
+            <w:tcBorders>
+              <w:top w:val="single" w:sz="4" w:color="000000"/>
+              <w:left w:val="single" w:sz="4" w:color="000000"/>
+              <w:bottom w:val="single" w:sz="4" w:color="000000"/>
+              <w:right w:val="single" w:sz="4" w:color="000000"/>
+            </w:tcBorders>
+          </w:tcPr>
+          <w:p>
+            <w:r>
+              <w:t>0.2451</w:t>
             </w:r>
           </w:p>
         </w:tc>
@@ -3047,39 +3047,39 @@
           </w:tcPr>
           <w:p>
             <w:r>
-              <w:t>0.555</w:t>
-            </w:r>
-          </w:p>
-        </w:tc>
-        <w:tc>
-          <w:tcPr>
-            <w:tcW w:type="dxa" w:w="1872"/>
-            <w:tcBorders>
-              <w:top w:val="single" w:sz="4" w:color="000000"/>
-              <w:left w:val="single" w:sz="4" w:color="000000"/>
-              <w:bottom w:val="single" w:sz="4" w:color="000000"/>
-              <w:right w:val="single" w:sz="4" w:color="000000"/>
-            </w:tcBorders>
-          </w:tcPr>
-          <w:p>
-            <w:r>
-              <w:t>0.547</w:t>
-            </w:r>
-          </w:p>
-        </w:tc>
-        <w:tc>
-          <w:tcPr>
-            <w:tcW w:type="dxa" w:w="1872"/>
-            <w:tcBorders>
-              <w:top w:val="single" w:sz="4" w:color="000000"/>
-              <w:left w:val="single" w:sz="4" w:color="000000"/>
-              <w:bottom w:val="single" w:sz="4" w:color="000000"/>
-              <w:right w:val="single" w:sz="4" w:color="000000"/>
-            </w:tcBorders>
-          </w:tcPr>
-          <w:p>
-            <w:r>
-              <w:t>0.330</w:t>
+              <w:t>0.5297</w:t>
+            </w:r>
+          </w:p>
+        </w:tc>
+        <w:tc>
+          <w:tcPr>
+            <w:tcW w:type="dxa" w:w="1872"/>
+            <w:tcBorders>
+              <w:top w:val="single" w:sz="4" w:color="000000"/>
+              <w:left w:val="single" w:sz="4" w:color="000000"/>
+              <w:bottom w:val="single" w:sz="4" w:color="000000"/>
+              <w:right w:val="single" w:sz="4" w:color="000000"/>
+            </w:tcBorders>
+          </w:tcPr>
+          <w:p>
+            <w:r>
+              <w:t>0.5192</w:t>
+            </w:r>
+          </w:p>
+        </w:tc>
+        <w:tc>
+          <w:tcPr>
+            <w:tcW w:type="dxa" w:w="1872"/>
+            <w:tcBorders>
+              <w:top w:val="single" w:sz="4" w:color="000000"/>
+              <w:left w:val="single" w:sz="4" w:color="000000"/>
+              <w:bottom w:val="single" w:sz="4" w:color="000000"/>
+              <w:right w:val="single" w:sz="4" w:color="000000"/>
+            </w:tcBorders>
+          </w:tcPr>
+          <w:p>
+            <w:r>
+              <w:t>0.2925</w:t>
             </w:r>
           </w:p>
         </w:tc>
@@ -3129,39 +3129,39 @@
           </w:tcPr>
           <w:p>
             <w:r>
-              <w:t>0.569</w:t>
-            </w:r>
-          </w:p>
-        </w:tc>
-        <w:tc>
-          <w:tcPr>
-            <w:tcW w:type="dxa" w:w="1872"/>
-            <w:tcBorders>
-              <w:top w:val="single" w:sz="4" w:color="000000"/>
-              <w:left w:val="single" w:sz="4" w:color="000000"/>
-              <w:bottom w:val="single" w:sz="4" w:color="000000"/>
-              <w:right w:val="single" w:sz="4" w:color="000000"/>
-            </w:tcBorders>
-          </w:tcPr>
-          <w:p>
-            <w:r>
-              <w:t>0.547</w:t>
-            </w:r>
-          </w:p>
-        </w:tc>
-        <w:tc>
-          <w:tcPr>
-            <w:tcW w:type="dxa" w:w="1872"/>
-            <w:tcBorders>
-              <w:top w:val="single" w:sz="4" w:color="000000"/>
-              <w:left w:val="single" w:sz="4" w:color="000000"/>
-              <w:bottom w:val="single" w:sz="4" w:color="000000"/>
-              <w:right w:val="single" w:sz="4" w:color="000000"/>
-            </w:tcBorders>
-          </w:tcPr>
-          <w:p>
-            <w:r>
-              <w:t>0.348</w:t>
+              <w:t>0.5091</w:t>
+            </w:r>
+          </w:p>
+        </w:tc>
+        <w:tc>
+          <w:tcPr>
+            <w:tcW w:type="dxa" w:w="1872"/>
+            <w:tcBorders>
+              <w:top w:val="single" w:sz="4" w:color="000000"/>
+              <w:left w:val="single" w:sz="4" w:color="000000"/>
+              <w:bottom w:val="single" w:sz="4" w:color="000000"/>
+              <w:right w:val="single" w:sz="4" w:color="000000"/>
+            </w:tcBorders>
+          </w:tcPr>
+          <w:p>
+            <w:r>
+              <w:t>0.5050</w:t>
+            </w:r>
+          </w:p>
+        </w:tc>
+        <w:tc>
+          <w:tcPr>
+            <w:tcW w:type="dxa" w:w="1872"/>
+            <w:tcBorders>
+              <w:top w:val="single" w:sz="4" w:color="000000"/>
+              <w:left w:val="single" w:sz="4" w:color="000000"/>
+              <w:bottom w:val="single" w:sz="4" w:color="000000"/>
+              <w:right w:val="single" w:sz="4" w:color="000000"/>
+            </w:tcBorders>
+          </w:tcPr>
+          <w:p>
+            <w:r>
+              <w:t>0.2628</w:t>
             </w:r>
           </w:p>
         </w:tc>
@@ -3169,7 +3169,7 @@
     </w:tbl>
     <w:p>
       <w:r>
-        <w:t>Las matrices de confusión muestran el patrón típico de problemas con bandas continuas: los aciertos se concentran en la diagonal pero las clases adyacentes (Bajo↔Medio, Medio↔Alto) son las más confundidas, mientras que los errores extremos Bajo↔Alto son raros. Esto refleja la naturaleza ordinal del problema y sugiere que un modelo ordinal-regression específico podría rendir mejor. Las curvas ROC One-vs-Rest evidencian que el modelo discrimina mejor las clases extremas (AUC &gt; 0.7) que la clase Medio (AUC ≈ 0.6), comportamiento esperado al definir clases por tertiles.</w:t>
+        <w:t>Las matrices de confusión muestran el patrón típico de problemas ordinales: errores concentrados entre clases adyacentes (Bajo↔Medio, Medio↔Alto), errores extremos raros. Las ROC One-vs-Rest evidencian mejor discriminación en clases extremas (AUC &gt; 0.7) que en la Medio (AUC ≈ 0.6) — comportamiento esperado al definir clases por tertiles.</w:t>
       </w:r>
     </w:p>
     <w:p>
@@ -3182,12 +3182,12 @@
     </w:p>
     <w:p>
       <w:r>
-        <w:t>Las curvas de aprendizaje del XGBoost de regresión muestran convergencia entre train y validación al usar el dataset completo, sin gap excesivo, indicando que el modelo NO está sobreajustado y que añadir más datos del mismo tipo no produciría grandes ganancias marginales. Esto sugiere que para mejorar más allá del R² ≈ 0.5 será necesario incorporar fuentes nuevas (sensores, NDVI, estaciones meteorológicas locales) en lugar de simplemente más filas. El análisis de errores por quintil de Y real revela que los mayores residuos ocurren en los extremos (Q1 y Q5) — los lotes de muy alta o muy baja productividad son los más difíciles de predecir, por lo que en producción conviene reportar intervalos de predicción y no solo punto-estimación.</w:t>
-      </w:r>
-    </w:p>
-    <w:p>
-      <w:r>
-        <w:t>Para clasificación, las curvas de aprendizaje del Random Forest revelan un cierto gap train-validación (clásico de RF), sugiriendo que hay margen para regularizar más vía min_samples_leaf más restrictivo. Los casos mal clasificados con alta confianza tienden a ser registros con valores de edad o cortes en zonas de transición entre clases — son candidatos a revisión por agrónomos o a un modelo con calibración de probabilidad.</w:t>
+        <w:t>Las curvas de aprendizaje de XGBoost convergen sin gap excesivo: el modelo NO está sobreajustado y añadir más filas del mismo tipo daría ganancias marginales. Para superar R² ≈ 0.5 hay que incorporar fuentes nuevas (sensores, NDVI). El análisis de errores por quintil revela mayores residuos en los extremos (Q1 y Q5): los lotes de productividad atípica son los más difíciles, por lo que en producción conviene reportar intervalos de predicción.</w:t>
+      </w:r>
+    </w:p>
+    <w:p>
+      <w:r>
+        <w:t>Para clasificación, RF muestra cierto gap train-validación (típico): hay margen regularizando más con min_samples_leaf restrictivo. Los errores con alta confianza ocurren en zonas de transición de edad/cortes — candidatos a revisión agrónoma o a calibración isotónica.</w:t>
       </w:r>
     </w:p>
     <w:p>
@@ -3214,10 +3214,34 @@
         <w:rPr>
           <w:b w:val="0"/>
         </w:rPr>
+        <w:t>• El XGBoost Regressor es el mejor predictor de TCH y %Sac.Caña (R² = 0.52 / 0.53), superando a OLS/Ridge (R² ≈ 0.32 / 0.27) por ~0.20 puntos, confirmando que las relaciones agronómicas son sustancialmente no lineales.</w:t>
+      </w:r>
+      <w:r/>
+    </w:p>
+    <w:p>
+      <w:pPr>
+        <w:ind w:left="340"/>
+      </w:pPr>
+      <w:r>
+        <w:rPr>
+          <w:b w:val="0"/>
+        </w:rPr>
+        <w:t>• Random Forest es el mejor clasificador para ambos targets (F1-macro = 0.47 nivel_TCH, 0.52 nivel_sacarosa; AUC-macro = 0.64 y 0.71 respectivamente).</w:t>
+      </w:r>
+      <w:r/>
+    </w:p>
+    <w:p>
+      <w:pPr>
+        <w:ind w:left="340"/>
+      </w:pPr>
+      <w:r>
+        <w:rPr>
+          <w:b w:val="0"/>
+        </w:rPr>
         <w:t xml:space="preserve">• </w:t>
       </w:r>
       <w:r>
-        <w:t>El XGBoost Regressor es el mejor predictor de TCH y %Sac.Caña, superando a OLS/Ridge en más del doble de R² (0.49–0.51 vs 0.16–0.20), confirmando que las relaciones agronómicas son fuertemente no lineales.</w:t>
+        <w:t>Las variables más influyentes son consistentes entre tareas y modelos: edad del cultivo, dosis de madurante, lluvias en periodo de maduración y variedad/zona — alineadas con la literatura agronómica del sector.</w:t>
       </w:r>
     </w:p>
     <w:p>
@@ -3231,7 +3255,7 @@
         <w:t xml:space="preserve">• </w:t>
       </w:r>
       <w:r>
-        <w:t>Los modelos de árbol (Random Forest y XGBoost) son también los mejores clasificadores de niveles de rendimiento, alcanzando F1-macro ≈ 0.49 (TCH) y 0.55 (sacarosa).</w:t>
+        <w:t>Los modelos lineales con OLS/Ridge resultan poco competitivos en R² pero mantienen valor interpretativo: identifican el sentido y la significancia estadística de los efectos.</w:t>
       </w:r>
     </w:p>
     <w:p>
@@ -3245,7 +3269,15 @@
         <w:t xml:space="preserve">• </w:t>
       </w:r>
       <w:r>
-        <w:t>Las variables más influyentes son consistentes entre tareas y modelos: edad del cultivo, dosis de madurante, lluvias en periodo de maduración y variedad/zona — alineadas con la literatura agronómica del sector.</w:t>
+        <w:t>El uso adecuado de Pipelines de scikit-learn con ColumnTransformer y validación cruzada garantiza ausencia de fuga de datos y reproducibilidad.</w:t>
+      </w:r>
+    </w:p>
+    <w:p>
+      <w:pPr>
+        <w:pStyle w:val="Heading2"/>
+      </w:pPr>
+      <w:r>
+        <w:t>4.2 Limitaciones</w:t>
       </w:r>
     </w:p>
     <w:p>
@@ -3259,7 +3291,7 @@
         <w:t xml:space="preserve">• </w:t>
       </w:r>
       <w:r>
-        <w:t>Los modelos lineales con OLS/Ridge resultan poco competitivos en R² pero mantienen valor interpretativo: identifican el sentido y la significancia estadística de los efectos.</w:t>
+        <w:t>BD_IPSA_1940 contiene una sola variedad (CC01-1940), por lo que los modelos de clasificación no generalizan a otras variedades sin reentrenamiento.</w:t>
       </w:r>
     </w:p>
     <w:p>
@@ -3270,10 +3302,22 @@
         <w:rPr>
           <w:b w:val="0"/>
         </w:rPr>
+        <w:t>• El R² ≈ 0.52 indica que existe variabilidad relevante no capturada por las variables actuales — probablemente atribuible a microclimatología, estado del suelo y prácticas específicas no registradas.</w:t>
+      </w:r>
+      <w:r/>
+    </w:p>
+    <w:p>
+      <w:pPr>
+        <w:ind w:left="340"/>
+      </w:pPr>
+      <w:r>
+        <w:rPr>
+          <w:b w:val="0"/>
+        </w:rPr>
         <w:t xml:space="preserve">• </w:t>
       </w:r>
       <w:r>
-        <w:t>El uso adecuado de Pipelines de scikit-learn con ColumnTransformer y validación cruzada garantiza ausencia de fuga de datos y reproducibilidad.</w:t>
+        <w:t>El split aleatorio es académicamente válido, pero en producción debería evaluarse con split temporal (entrenar con periodos pasados, evaluar en periodo más reciente) para estimar el desempeño real al desplegar.</w:t>
       </w:r>
     </w:p>
     <w:p>
@@ -3281,7 +3325,7 @@
         <w:pStyle w:val="Heading2"/>
       </w:pPr>
       <w:r>
-        <w:t>4.2 Limitaciones</w:t>
+        <w:t>4.3 Trabajo Futuro</w:t>
       </w:r>
     </w:p>
     <w:p>
@@ -3295,7 +3339,7 @@
         <w:t xml:space="preserve">• </w:t>
       </w:r>
       <w:r>
-        <w:t>BD_IPSA_1940 contiene una sola variedad (CC01-1940), por lo que los modelos de clasificación no generalizan a otras variedades sin reentrenamiento.</w:t>
+        <w:t>Incorporar fuentes externas: imágenes satelitales (NDVI, EVI), sensores de humedad foliar y estaciones meteorológicas locales — la literatura sugiere ganancias hasta R² ≈ 0.7–0.9 en sacarosa cuando se incluye información satelital.</w:t>
       </w:r>
     </w:p>
     <w:p>
@@ -3309,7 +3353,7 @@
         <w:t xml:space="preserve">• </w:t>
       </w:r>
       <w:r>
-        <w:t>El R² ≈ 0.5 indica que existe variabilidad relevante no capturada por las variables actuales — probablemente atribuible a microclimatología, estado del suelo y prácticas específicas no registradas.</w:t>
+        <w:t>Probar modelos de regresión ordinal para clasificación (acordes a la naturaleza ordinal de Bajo/Medio/Alto) y modelos de calibración isotónica de probabilidades.</w:t>
       </w:r>
     </w:p>
     <w:p>
@@ -3323,15 +3367,7 @@
         <w:t xml:space="preserve">• </w:t>
       </w:r>
       <w:r>
-        <w:t>El split aleatorio es académicamente válido, pero en producción debería evaluarse con split temporal (entrenar con periodos pasados, evaluar en periodo más reciente) para estimar el desempeño real al desplegar.</w:t>
-      </w:r>
-    </w:p>
-    <w:p>
-      <w:pPr>
-        <w:pStyle w:val="Heading2"/>
-      </w:pPr>
-      <w:r>
-        <w:t>4.3 Trabajo Futuro</w:t>
+        <w:t>Integrar los modelos en un sistema de monitoreo en tiempo real para apoyar decisiones de fecha de cosecha óptima, dosis y momento de aplicación de madurante por lote.</w:t>
       </w:r>
     </w:p>
     <w:p>
@@ -3345,7 +3381,15 @@
         <w:t xml:space="preserve">• </w:t>
       </w:r>
       <w:r>
-        <w:t>Incorporar fuentes externas: imágenes satelitales (NDVI, EVI), sensores de humedad foliar y estaciones meteorológicas locales — la literatura sugiere ganancias hasta R² ≈ 0.7–0.9 en sacarosa cuando se incluye información satelital.</w:t>
+        <w:t>Realizar análisis de feature importance con SHAP para producir explicaciones a nivel de lote individual, útiles para retroalimentación operativa con los agrónomos.</w:t>
+      </w:r>
+    </w:p>
+    <w:p>
+      <w:pPr>
+        <w:pStyle w:val="Heading1"/>
+      </w:pPr>
+      <w:r>
+        <w:t>5. Referencias</w:t>
       </w:r>
     </w:p>
     <w:p>
@@ -3359,7 +3403,7 @@
         <w:t xml:space="preserve">• </w:t>
       </w:r>
       <w:r>
-        <w:t>Probar modelos de regresión ordinal para clasificación (acordes a la naturaleza ordinal de Bajo/Medio/Alto) y modelos de calibración isotónica de probabilidades.</w:t>
+        <w:t>Asocaña. (2023). Informe Anual del Sector Azucarero Colombiano. Cali: Asociación de Cultivadores de Caña de Azúcar de Colombia.</w:t>
       </w:r>
     </w:p>
     <w:p>
@@ -3373,7 +3417,7 @@
         <w:t xml:space="preserve">• </w:t>
       </w:r>
       <w:r>
-        <w:t>Integrar los modelos en un sistema de monitoreo en tiempo real para apoyar decisiones de fecha de cosecha óptima, dosis y momento de aplicación de madurante por lote.</w:t>
+        <w:t>Cenicaña. (2022). Variedades de caña de azúcar para el Valle del río Cauca: criterios de selección y rendimientos. Cali: Centro de Investigación de la Caña de Azúcar de Colombia.</w:t>
       </w:r>
     </w:p>
     <w:p>
@@ -3387,7 +3431,82 @@
         <w:t xml:space="preserve">• </w:t>
       </w:r>
       <w:r>
-        <w:t>Realizar análisis de feature importance con SHAP para producir explicaciones a nivel de lote individual, útiles para retroalimentación operativa con los agrónomos.</w:t>
+        <w:t>Ingenio Providencia. (2023). Reporte de Sostenibilidad. El Cerrito, Valle del Cauca.</w:t>
+      </w:r>
+    </w:p>
+    <w:p>
+      <w:pPr>
+        <w:ind w:left="340"/>
+      </w:pPr>
+      <w:r>
+        <w:rPr>
+          <w:b w:val="0"/>
+        </w:rPr>
+        <w:t xml:space="preserve">• </w:t>
+      </w:r>
+      <w:r>
+        <w:t>Breiman, L. (2001). Random Forests. Machine Learning, 45(1), 5–32.</w:t>
+      </w:r>
+    </w:p>
+    <w:p>
+      <w:pPr>
+        <w:ind w:left="340"/>
+      </w:pPr>
+      <w:r>
+        <w:rPr>
+          <w:b w:val="0"/>
+        </w:rPr>
+        <w:t xml:space="preserve">• </w:t>
+      </w:r>
+      <w:r>
+        <w:t>Chen, T., &amp; Guestrin, C. (2016). XGBoost: A Scalable Tree Boosting System. Proceedings of the 22nd ACM SIGKDD International Conference on Knowledge Discovery and Data Mining (pp. 785–794).</w:t>
+      </w:r>
+    </w:p>
+    <w:p>
+      <w:pPr>
+        <w:ind w:left="340"/>
+      </w:pPr>
+      <w:r>
+        <w:rPr>
+          <w:b w:val="0"/>
+        </w:rPr>
+        <w:t xml:space="preserve">• </w:t>
+      </w:r>
+      <w:r>
+        <w:t>Pedregosa, F., et al. (2011). Scikit-learn: Machine Learning in Python. Journal of Machine Learning Research, 12, 2825–2830.</w:t>
+      </w:r>
+    </w:p>
+    <w:p>
+      <w:pPr>
+        <w:ind w:left="340"/>
+      </w:pPr>
+      <w:r>
+        <w:rPr>
+          <w:b w:val="0"/>
+        </w:rPr>
+        <w:t xml:space="preserve">• </w:t>
+      </w:r>
+      <w:r>
+        <w:t>Everingham, Y. L., Sexton, J., Skocaj, D., &amp; Inman-Bamber, G. (2016). Accurate prediction of sugarcane yield using a random forest algorithm. Agronomy for Sustainable Development, 36(2), 27.</w:t>
+      </w:r>
+    </w:p>
+    <w:p>
+      <w:pPr>
+        <w:ind w:left="340"/>
+      </w:pPr>
+      <w:r>
+        <w:rPr>
+          <w:b w:val="0"/>
+        </w:rPr>
+        <w:t xml:space="preserve">• </w:t>
+      </w:r>
+      <w:r>
+        <w:t>Hammer, R. G., et al. (2020). Sugarcane yield prediction through data mining and crop simulation models. Sugar Tech, 22, 216–225.</w:t>
+      </w:r>
+    </w:p>
+    <w:p>
+      <w:r>
+        <w:br w:type="page"/>
       </w:r>
     </w:p>
     <w:p>
@@ -3395,119 +3514,362 @@
         <w:pStyle w:val="Heading1"/>
       </w:pPr>
       <w:r>
-        <w:t>5. Referencias</w:t>
-      </w:r>
-    </w:p>
-    <w:p>
-      <w:pPr>
-        <w:ind w:left="340"/>
-      </w:pPr>
-      <w:r>
-        <w:rPr>
-          <w:b w:val="0"/>
-        </w:rPr>
-        <w:t xml:space="preserve">• </w:t>
-      </w:r>
-      <w:r>
-        <w:t>Asocaña. (2023). Informe Anual del Sector Azucarero Colombiano. Cali: Asociación de Cultivadores de Caña de Azúcar de Colombia.</w:t>
-      </w:r>
-    </w:p>
-    <w:p>
-      <w:pPr>
-        <w:ind w:left="340"/>
-      </w:pPr>
-      <w:r>
-        <w:rPr>
-          <w:b w:val="0"/>
-        </w:rPr>
-        <w:t xml:space="preserve">• </w:t>
-      </w:r>
-      <w:r>
-        <w:t>Cenicaña. (2022). Variedades de caña de azúcar para el Valle del río Cauca: criterios de selección y rendimientos. Cali: Centro de Investigación de la Caña de Azúcar de Colombia.</w:t>
-      </w:r>
-    </w:p>
-    <w:p>
-      <w:pPr>
-        <w:ind w:left="340"/>
-      </w:pPr>
-      <w:r>
-        <w:rPr>
-          <w:b w:val="0"/>
-        </w:rPr>
-        <w:t xml:space="preserve">• </w:t>
-      </w:r>
-      <w:r>
-        <w:t>Ingenio Providencia. (2023). Reporte de Sostenibilidad. El Cerrito, Valle del Cauca.</w:t>
-      </w:r>
-    </w:p>
-    <w:p>
-      <w:pPr>
-        <w:ind w:left="340"/>
-      </w:pPr>
-      <w:r>
-        <w:rPr>
-          <w:b w:val="0"/>
-        </w:rPr>
-        <w:t xml:space="preserve">• </w:t>
-      </w:r>
-      <w:r>
-        <w:t>Breiman, L. (2001). Random Forests. Machine Learning, 45(1), 5–32.</w:t>
-      </w:r>
-    </w:p>
-    <w:p>
-      <w:pPr>
-        <w:ind w:left="340"/>
-      </w:pPr>
-      <w:r>
-        <w:rPr>
-          <w:b w:val="0"/>
-        </w:rPr>
-        <w:t xml:space="preserve">• </w:t>
-      </w:r>
-      <w:r>
-        <w:t>Chen, T., &amp; Guestrin, C. (2016). XGBoost: A Scalable Tree Boosting System. Proceedings of the 22nd ACM SIGKDD International Conference on Knowledge Discovery and Data Mining (pp. 785–794).</w:t>
-      </w:r>
-    </w:p>
-    <w:p>
-      <w:pPr>
-        <w:ind w:left="340"/>
-      </w:pPr>
-      <w:r>
-        <w:rPr>
-          <w:b w:val="0"/>
-        </w:rPr>
-        <w:t xml:space="preserve">• </w:t>
-      </w:r>
-      <w:r>
-        <w:t>Pedregosa, F., et al. (2011). Scikit-learn: Machine Learning in Python. Journal of Machine Learning Research, 12, 2825–2830.</w:t>
-      </w:r>
-    </w:p>
-    <w:p>
-      <w:pPr>
-        <w:ind w:left="340"/>
-      </w:pPr>
-      <w:r>
-        <w:rPr>
-          <w:b w:val="0"/>
-        </w:rPr>
-        <w:t xml:space="preserve">• </w:t>
-      </w:r>
-      <w:r>
-        <w:t>Everingham, Y. L., Sexton, J., Skocaj, D., &amp; Inman-Bamber, G. (2016). Accurate prediction of sugarcane yield using a random forest algorithm. Agronomy for Sustainable Development, 36(2), 27.</w:t>
-      </w:r>
-    </w:p>
-    <w:p>
-      <w:pPr>
-        <w:ind w:left="340"/>
-      </w:pPr>
-      <w:r>
-        <w:rPr>
-          <w:b w:val="0"/>
-        </w:rPr>
-        <w:t xml:space="preserve">• </w:t>
-      </w:r>
-      <w:r>
-        <w:t>Hammer, R. G., et al. (2020). Sugarcane yield prediction through data mining and crop simulation models. Sugar Tech, 22, 216–225.</w:t>
+        <w:t>Anexo A – Figuras de Apoyo</w:t>
+      </w:r>
+    </w:p>
+    <w:p>
+      <w:r>
+        <w:t>Las siguientes figuras complementan el cuerpo del informe y soportan los resultados discutidos. Todas son generadas por los notebooks ejecutados (tarea2_eda_preprocesamiento.ipynb y tarea3_modelamiento.ipynb).</w:t>
+      </w:r>
+    </w:p>
+    <w:p>
+      <w:pPr>
+        <w:jc w:val="center"/>
+      </w:pPr>
+      <w:r>
+        <w:drawing>
+          <wp:inline>
+            <wp:extent cx="5400000" cy="3987591"/>
+            <wp:docPr id="1" name="Picture 1"/>
+            <wp:cNvGraphicFramePr>
+              <a:graphicFrameLocks noChangeAspect="1"/>
+            </wp:cNvGraphicFramePr>
+            <a:graphic>
+              <a:graphicData uri="http://schemas.openxmlformats.org/drawingml/2006/picture">
+                <pic:pic>
+                  <pic:nvPicPr>
+                    <pic:cNvPr id="0" name="image.png"/>
+                    <pic:cNvPicPr/>
+                  </pic:nvPicPr>
+                  <pic:blipFill>
+                    <a:blip r:embed="rId18"/>
+                    <a:stretch>
+                      <a:fillRect/>
+                    </a:stretch>
+                  </pic:blipFill>
+                  <pic:spPr>
+                    <a:xfrm>
+                      <a:off x="0" y="0"/>
+                      <a:ext cx="5400000" cy="3987591"/>
+                    </a:xfrm>
+                    <a:prstGeom prst="rect"/>
+                  </pic:spPr>
+                </pic:pic>
+              </a:graphicData>
+            </a:graphic>
+          </wp:inline>
+        </w:drawing>
+      </w:r>
+    </w:p>
+    <w:p>
+      <w:pPr>
+        <w:jc w:val="center"/>
+      </w:pPr>
+      <w:r>
+        <w:rPr>
+          <w:i/>
+        </w:rPr>
+        <w:t>Figura 1. Distribución de TCH y %Sac.Caña – HISTORICO_SUERTES.</w:t>
+      </w:r>
+    </w:p>
+    <w:p>
+      <w:pPr>
+        <w:jc w:val="center"/>
+      </w:pPr>
+      <w:r>
+        <w:drawing>
+          <wp:inline>
+            <wp:extent cx="5400000" cy="4762332"/>
+            <wp:docPr id="2" name="Picture 2"/>
+            <wp:cNvGraphicFramePr>
+              <a:graphicFrameLocks noChangeAspect="1"/>
+            </wp:cNvGraphicFramePr>
+            <a:graphic>
+              <a:graphicData uri="http://schemas.openxmlformats.org/drawingml/2006/picture">
+                <pic:pic>
+                  <pic:nvPicPr>
+                    <pic:cNvPr id="0" name="image.png"/>
+                    <pic:cNvPicPr/>
+                  </pic:nvPicPr>
+                  <pic:blipFill>
+                    <a:blip r:embed="rId19"/>
+                    <a:stretch>
+                      <a:fillRect/>
+                    </a:stretch>
+                  </pic:blipFill>
+                  <pic:spPr>
+                    <a:xfrm>
+                      <a:off x="0" y="0"/>
+                      <a:ext cx="5400000" cy="4762332"/>
+                    </a:xfrm>
+                    <a:prstGeom prst="rect"/>
+                  </pic:spPr>
+                </pic:pic>
+              </a:graphicData>
+            </a:graphic>
+          </wp:inline>
+        </w:drawing>
+      </w:r>
+    </w:p>
+    <w:p>
+      <w:pPr>
+        <w:jc w:val="center"/>
+      </w:pPr>
+      <w:r>
+        <w:rPr>
+          <w:i/>
+        </w:rPr>
+        <w:t>Figura 2. Matriz de correlación – variables numéricas (regresión).</w:t>
+      </w:r>
+    </w:p>
+    <w:p>
+      <w:pPr>
+        <w:jc w:val="center"/>
+      </w:pPr>
+      <w:r>
+        <w:drawing>
+          <wp:inline>
+            <wp:extent cx="5400000" cy="2675229"/>
+            <wp:docPr id="3" name="Picture 3"/>
+            <wp:cNvGraphicFramePr>
+              <a:graphicFrameLocks noChangeAspect="1"/>
+            </wp:cNvGraphicFramePr>
+            <a:graphic>
+              <a:graphicData uri="http://schemas.openxmlformats.org/drawingml/2006/picture">
+                <pic:pic>
+                  <pic:nvPicPr>
+                    <pic:cNvPr id="0" name="image.png"/>
+                    <pic:cNvPicPr/>
+                  </pic:nvPicPr>
+                  <pic:blipFill>
+                    <a:blip r:embed="rId20"/>
+                    <a:stretch>
+                      <a:fillRect/>
+                    </a:stretch>
+                  </pic:blipFill>
+                  <pic:spPr>
+                    <a:xfrm>
+                      <a:off x="0" y="0"/>
+                      <a:ext cx="5400000" cy="2675229"/>
+                    </a:xfrm>
+                    <a:prstGeom prst="rect"/>
+                  </pic:spPr>
+                </pic:pic>
+              </a:graphicData>
+            </a:graphic>
+          </wp:inline>
+        </w:drawing>
+      </w:r>
+    </w:p>
+    <w:p>
+      <w:pPr>
+        <w:jc w:val="center"/>
+      </w:pPr>
+      <w:r>
+        <w:rPr>
+          <w:i/>
+        </w:rPr>
+        <w:t>Figura 3. Real vs Predicho – modelos de regresión.</w:t>
+      </w:r>
+    </w:p>
+    <w:p>
+      <w:pPr>
+        <w:jc w:val="center"/>
+      </w:pPr>
+      <w:r>
+        <w:drawing>
+          <wp:inline>
+            <wp:extent cx="5400000" cy="4012048"/>
+            <wp:docPr id="4" name="Picture 4"/>
+            <wp:cNvGraphicFramePr>
+              <a:graphicFrameLocks noChangeAspect="1"/>
+            </wp:cNvGraphicFramePr>
+            <a:graphic>
+              <a:graphicData uri="http://schemas.openxmlformats.org/drawingml/2006/picture">
+                <pic:pic>
+                  <pic:nvPicPr>
+                    <pic:cNvPr id="0" name="image.png"/>
+                    <pic:cNvPicPr/>
+                  </pic:nvPicPr>
+                  <pic:blipFill>
+                    <a:blip r:embed="rId21"/>
+                    <a:stretch>
+                      <a:fillRect/>
+                    </a:stretch>
+                  </pic:blipFill>
+                  <pic:spPr>
+                    <a:xfrm>
+                      <a:off x="0" y="0"/>
+                      <a:ext cx="5400000" cy="4012048"/>
+                    </a:xfrm>
+                    <a:prstGeom prst="rect"/>
+                  </pic:spPr>
+                </pic:pic>
+              </a:graphicData>
+            </a:graphic>
+          </wp:inline>
+        </w:drawing>
+      </w:r>
+    </w:p>
+    <w:p>
+      <w:pPr>
+        <w:jc w:val="center"/>
+      </w:pPr>
+      <w:r>
+        <w:rPr>
+          <w:i/>
+        </w:rPr>
+        <w:t>Figura 4. Feature Importance – Random Forest y XGBoost (regresión).</w:t>
+      </w:r>
+    </w:p>
+    <w:p>
+      <w:pPr>
+        <w:jc w:val="center"/>
+      </w:pPr>
+      <w:r>
+        <w:drawing>
+          <wp:inline>
+            <wp:extent cx="5400000" cy="2672777"/>
+            <wp:docPr id="5" name="Picture 5"/>
+            <wp:cNvGraphicFramePr>
+              <a:graphicFrameLocks noChangeAspect="1"/>
+            </wp:cNvGraphicFramePr>
+            <a:graphic>
+              <a:graphicData uri="http://schemas.openxmlformats.org/drawingml/2006/picture">
+                <pic:pic>
+                  <pic:nvPicPr>
+                    <pic:cNvPr id="0" name="image.png"/>
+                    <pic:cNvPicPr/>
+                  </pic:nvPicPr>
+                  <pic:blipFill>
+                    <a:blip r:embed="rId22"/>
+                    <a:stretch>
+                      <a:fillRect/>
+                    </a:stretch>
+                  </pic:blipFill>
+                  <pic:spPr>
+                    <a:xfrm>
+                      <a:off x="0" y="0"/>
+                      <a:ext cx="5400000" cy="2672777"/>
+                    </a:xfrm>
+                    <a:prstGeom prst="rect"/>
+                  </pic:spPr>
+                </pic:pic>
+              </a:graphicData>
+            </a:graphic>
+          </wp:inline>
+        </w:drawing>
+      </w:r>
+    </w:p>
+    <w:p>
+      <w:pPr>
+        <w:jc w:val="center"/>
+      </w:pPr>
+      <w:r>
+        <w:rPr>
+          <w:i/>
+        </w:rPr>
+        <w:t>Figura 5. Matrices de confusión – clasificación.</w:t>
+      </w:r>
+    </w:p>
+    <w:p>
+      <w:pPr>
+        <w:jc w:val="center"/>
+      </w:pPr>
+      <w:r>
+        <w:drawing>
+          <wp:inline>
+            <wp:extent cx="5400000" cy="2672777"/>
+            <wp:docPr id="6" name="Picture 6"/>
+            <wp:cNvGraphicFramePr>
+              <a:graphicFrameLocks noChangeAspect="1"/>
+            </wp:cNvGraphicFramePr>
+            <a:graphic>
+              <a:graphicData uri="http://schemas.openxmlformats.org/drawingml/2006/picture">
+                <pic:pic>
+                  <pic:nvPicPr>
+                    <pic:cNvPr id="0" name="image.png"/>
+                    <pic:cNvPicPr/>
+                  </pic:nvPicPr>
+                  <pic:blipFill>
+                    <a:blip r:embed="rId23"/>
+                    <a:stretch>
+                      <a:fillRect/>
+                    </a:stretch>
+                  </pic:blipFill>
+                  <pic:spPr>
+                    <a:xfrm>
+                      <a:off x="0" y="0"/>
+                      <a:ext cx="5400000" cy="2672777"/>
+                    </a:xfrm>
+                    <a:prstGeom prst="rect"/>
+                  </pic:spPr>
+                </pic:pic>
+              </a:graphicData>
+            </a:graphic>
+          </wp:inline>
+        </w:drawing>
+      </w:r>
+    </w:p>
+    <w:p>
+      <w:pPr>
+        <w:jc w:val="center"/>
+      </w:pPr>
+      <w:r>
+        <w:rPr>
+          <w:i/>
+        </w:rPr>
+        <w:t>Figura 6. Curvas ROC One-vs-Rest – clasificación.</w:t>
+      </w:r>
+    </w:p>
+    <w:p>
+      <w:pPr>
+        <w:jc w:val="center"/>
+      </w:pPr>
+      <w:r>
+        <w:drawing>
+          <wp:inline>
+            <wp:extent cx="5400000" cy="3836842"/>
+            <wp:docPr id="7" name="Picture 7"/>
+            <wp:cNvGraphicFramePr>
+              <a:graphicFrameLocks noChangeAspect="1"/>
+            </wp:cNvGraphicFramePr>
+            <a:graphic>
+              <a:graphicData uri="http://schemas.openxmlformats.org/drawingml/2006/picture">
+                <pic:pic>
+                  <pic:nvPicPr>
+                    <pic:cNvPr id="0" name="image.png"/>
+                    <pic:cNvPicPr/>
+                  </pic:nvPicPr>
+                  <pic:blipFill>
+                    <a:blip r:embed="rId24"/>
+                    <a:stretch>
+                      <a:fillRect/>
+                    </a:stretch>
+                  </pic:blipFill>
+                  <pic:spPr>
+                    <a:xfrm>
+                      <a:off x="0" y="0"/>
+                      <a:ext cx="5400000" cy="3836842"/>
+                    </a:xfrm>
+                    <a:prstGeom prst="rect"/>
+                  </pic:spPr>
+                </pic:pic>
+              </a:graphicData>
+            </a:graphic>
+          </wp:inline>
+        </w:drawing>
+      </w:r>
+    </w:p>
+    <w:p>
+      <w:pPr>
+        <w:jc w:val="center"/>
+      </w:pPr>
+      <w:r>
+        <w:rPr>
+          <w:i/>
+        </w:rPr>
+        <w:t>Figura 7. Curvas de aprendizaje – mejores modelos.</w:t>
       </w:r>
     </w:p>
     <w:sectPr>

</xml_diff>